<commit_message>
hw3 part 3 done
</commit_message>
<xml_diff>
--- a/Assignment3/Writeup.docx
+++ b/Assignment3/Writeup.docx
@@ -122,35 +122,7 @@
         <w:rPr>
           <w:color w:val="EE0000"/>
         </w:rPr>
-        <w:t>1 – (25/</w:t>
-      </w:r>
-      <w:proofErr w:type="gramStart"/>
-      <w:r>
-        <w:rPr>
-          <w:color w:val="EE0000"/>
-        </w:rPr>
-        <w:t>40)^</w:t>
-      </w:r>
-      <w:proofErr w:type="gramEnd"/>
-      <w:r>
-        <w:rPr>
-          <w:color w:val="EE0000"/>
-        </w:rPr>
-        <w:t>2-(15/</w:t>
-      </w:r>
-      <w:proofErr w:type="gramStart"/>
-      <w:r>
-        <w:rPr>
-          <w:color w:val="EE0000"/>
-        </w:rPr>
-        <w:t>40)^</w:t>
-      </w:r>
-      <w:proofErr w:type="gramEnd"/>
-      <w:r>
-        <w:rPr>
-          <w:color w:val="EE0000"/>
-        </w:rPr>
-        <w:t xml:space="preserve">2 = </w:t>
+        <w:t xml:space="preserve">1 – (25/40)^2-(15/40)^2 = </w:t>
       </w:r>
       <w:r>
         <w:rPr>
@@ -174,35 +146,7 @@
         <w:rPr>
           <w:color w:val="EE0000"/>
         </w:rPr>
-        <w:t>For the left child with 22 samples (20A, 2B), the Gini impurity is 1- (20/</w:t>
-      </w:r>
-      <w:proofErr w:type="gramStart"/>
-      <w:r>
-        <w:rPr>
-          <w:color w:val="EE0000"/>
-        </w:rPr>
-        <w:t>22)^</w:t>
-      </w:r>
-      <w:proofErr w:type="gramEnd"/>
-      <w:r>
-        <w:rPr>
-          <w:color w:val="EE0000"/>
-        </w:rPr>
-        <w:t>2-(2/</w:t>
-      </w:r>
-      <w:proofErr w:type="gramStart"/>
-      <w:r>
-        <w:rPr>
-          <w:color w:val="EE0000"/>
-        </w:rPr>
-        <w:t>22)^</w:t>
-      </w:r>
-      <w:proofErr w:type="gramEnd"/>
-      <w:r>
-        <w:rPr>
-          <w:color w:val="EE0000"/>
-        </w:rPr>
-        <w:t>2 = 0.1653</w:t>
+        <w:t>For the left child with 22 samples (20A, 2B), the Gini impurity is 1- (20/22)^2-(2/22)^2 = 0.1653</w:t>
       </w:r>
     </w:p>
     <w:p>
@@ -234,7 +178,6 @@
         </w:rPr>
         <w:t>/</w:t>
       </w:r>
-      <w:proofErr w:type="gramStart"/>
       <w:r>
         <w:rPr>
           <w:color w:val="EE0000"/>
@@ -245,14 +188,7 @@
         <w:rPr>
           <w:color w:val="EE0000"/>
         </w:rPr>
-        <w:t>)^</w:t>
-      </w:r>
-      <w:proofErr w:type="gramEnd"/>
-      <w:r>
-        <w:rPr>
-          <w:color w:val="EE0000"/>
-        </w:rPr>
-        <w:t>2-(</w:t>
+        <w:t>)^2-(</w:t>
       </w:r>
       <w:r>
         <w:rPr>
@@ -266,7 +202,6 @@
         </w:rPr>
         <w:t>/</w:t>
       </w:r>
-      <w:proofErr w:type="gramStart"/>
       <w:r>
         <w:rPr>
           <w:color w:val="EE0000"/>
@@ -277,14 +212,7 @@
         <w:rPr>
           <w:color w:val="EE0000"/>
         </w:rPr>
-        <w:t>)^</w:t>
-      </w:r>
-      <w:proofErr w:type="gramEnd"/>
-      <w:r>
-        <w:rPr>
-          <w:color w:val="EE0000"/>
-        </w:rPr>
-        <w:t>2 = 0.</w:t>
+        <w:t>)^2 = 0.</w:t>
       </w:r>
       <w:r>
         <w:rPr>
@@ -322,19 +250,11 @@
         </w:rPr>
         <w:t xml:space="preserve">the sum of the weighted impurities - </w:t>
       </w:r>
-      <w:proofErr w:type="spellStart"/>
-      <w:r>
-        <w:rPr>
-          <w:color w:val="EE0000"/>
-        </w:rPr>
-        <w:t>G_split</w:t>
-      </w:r>
-      <w:proofErr w:type="spellEnd"/>
-      <w:r>
-        <w:rPr>
-          <w:color w:val="EE0000"/>
-        </w:rPr>
-        <w:t xml:space="preserve"> = </w:t>
+      <w:r>
+        <w:rPr>
+          <w:color w:val="EE0000"/>
+        </w:rPr>
+        <w:t xml:space="preserve">G_split = </w:t>
       </w:r>
       <w:r>
         <w:rPr>
@@ -364,41 +284,13 @@
         <w:rPr>
           <w:color w:val="EE0000"/>
         </w:rPr>
-        <w:t xml:space="preserve">The final </w:t>
-      </w:r>
-      <w:proofErr w:type="spellStart"/>
-      <w:r>
-        <w:rPr>
-          <w:color w:val="EE0000"/>
-        </w:rPr>
-        <w:t>gini</w:t>
-      </w:r>
-      <w:proofErr w:type="spellEnd"/>
-      <w:r>
-        <w:rPr>
-          <w:color w:val="EE0000"/>
-        </w:rPr>
-        <w:t xml:space="preserve"> decrease would be the parent node impurity</w:t>
-      </w:r>
-      <w:r>
-        <w:rPr>
-          <w:color w:val="EE0000"/>
-        </w:rPr>
-        <w:t xml:space="preserve"> minus the </w:t>
-      </w:r>
-      <w:proofErr w:type="spellStart"/>
-      <w:r>
-        <w:rPr>
-          <w:color w:val="EE0000"/>
-        </w:rPr>
-        <w:t>gini</w:t>
-      </w:r>
-      <w:proofErr w:type="spellEnd"/>
-      <w:r>
-        <w:rPr>
-          <w:color w:val="EE0000"/>
-        </w:rPr>
-        <w:t xml:space="preserve"> split</w:t>
+        <w:t>The final gini decrease would be the parent node impurity</w:t>
+      </w:r>
+      <w:r>
+        <w:rPr>
+          <w:color w:val="EE0000"/>
+        </w:rPr>
+        <w:t xml:space="preserve"> minus the gini split</w:t>
       </w:r>
       <w:r>
         <w:rPr>
@@ -461,21 +353,7 @@
         <w:rPr>
           <w:color w:val="EE0000"/>
         </w:rPr>
-        <w:t>Entropy is = -(25/</w:t>
-      </w:r>
-      <w:proofErr w:type="gramStart"/>
-      <w:r>
-        <w:rPr>
-          <w:color w:val="EE0000"/>
-        </w:rPr>
-        <w:t>40)log</w:t>
-      </w:r>
-      <w:proofErr w:type="gramEnd"/>
-      <w:r>
-        <w:rPr>
-          <w:color w:val="EE0000"/>
-        </w:rPr>
-        <w:t xml:space="preserve">_2(25/40) </w:t>
+        <w:t xml:space="preserve">Entropy is = -(25/40)log_2(25/40) </w:t>
       </w:r>
       <w:r>
         <w:rPr>
@@ -493,21 +371,7 @@
         <w:rPr>
           <w:color w:val="EE0000"/>
         </w:rPr>
-        <w:t>(15/</w:t>
-      </w:r>
-      <w:proofErr w:type="gramStart"/>
-      <w:r>
-        <w:rPr>
-          <w:color w:val="EE0000"/>
-        </w:rPr>
-        <w:t>40)log</w:t>
-      </w:r>
-      <w:proofErr w:type="gramEnd"/>
-      <w:r>
-        <w:rPr>
-          <w:color w:val="EE0000"/>
-        </w:rPr>
-        <w:t>_2(15/40) = 0.9544</w:t>
+        <w:t>(15/40)log_2(15/40) = 0.9544</w:t>
       </w:r>
     </w:p>
     <w:p>
@@ -531,35 +395,7 @@
         <w:rPr>
           <w:color w:val="EE0000"/>
         </w:rPr>
-        <w:t xml:space="preserve"> is = -(20/</w:t>
-      </w:r>
-      <w:proofErr w:type="gramStart"/>
-      <w:r>
-        <w:rPr>
-          <w:color w:val="EE0000"/>
-        </w:rPr>
-        <w:t>22)log</w:t>
-      </w:r>
-      <w:proofErr w:type="gramEnd"/>
-      <w:r>
-        <w:rPr>
-          <w:color w:val="EE0000"/>
-        </w:rPr>
-        <w:t>_2(20/22) – (2/</w:t>
-      </w:r>
-      <w:proofErr w:type="gramStart"/>
-      <w:r>
-        <w:rPr>
-          <w:color w:val="EE0000"/>
-        </w:rPr>
-        <w:t>22)log</w:t>
-      </w:r>
-      <w:proofErr w:type="gramEnd"/>
-      <w:r>
-        <w:rPr>
-          <w:color w:val="EE0000"/>
-        </w:rPr>
-        <w:t>_2(2/22) = 0.4395</w:t>
+        <w:t xml:space="preserve"> is = -(20/22)log_2(20/22) – (2/22)log_2(2/22) = 0.4395</w:t>
       </w:r>
     </w:p>
     <w:p>
@@ -583,35 +419,7 @@
         <w:rPr>
           <w:color w:val="EE0000"/>
         </w:rPr>
-        <w:t>Entropy is = -(5/</w:t>
-      </w:r>
-      <w:proofErr w:type="gramStart"/>
-      <w:r>
-        <w:rPr>
-          <w:color w:val="EE0000"/>
-        </w:rPr>
-        <w:t>18)log</w:t>
-      </w:r>
-      <w:proofErr w:type="gramEnd"/>
-      <w:r>
-        <w:rPr>
-          <w:color w:val="EE0000"/>
-        </w:rPr>
-        <w:t>_2(5/18) – (13/</w:t>
-      </w:r>
-      <w:proofErr w:type="gramStart"/>
-      <w:r>
-        <w:rPr>
-          <w:color w:val="EE0000"/>
-        </w:rPr>
-        <w:t>18)log</w:t>
-      </w:r>
-      <w:proofErr w:type="gramEnd"/>
-      <w:r>
-        <w:rPr>
-          <w:color w:val="EE0000"/>
-        </w:rPr>
-        <w:t>_2(13/18) = 0.8524</w:t>
+        <w:t>Entropy is = -(5/18)log_2(5/18) – (13/18)log_2(13/18) = 0.8524</w:t>
       </w:r>
     </w:p>
     <w:p>
@@ -653,30 +461,8 @@
         <w:rPr>
           <w:color w:val="EE0000"/>
         </w:rPr>
-        <w:t xml:space="preserve"> = (22/</w:t>
-      </w:r>
-      <w:proofErr w:type="gramStart"/>
-      <w:r>
-        <w:rPr>
-          <w:color w:val="EE0000"/>
-        </w:rPr>
-        <w:t>40)*</w:t>
-      </w:r>
-      <w:proofErr w:type="gramEnd"/>
-      <w:r>
-        <w:rPr>
-          <w:color w:val="EE0000"/>
-        </w:rPr>
-        <w:t>0.4395 + (18/</w:t>
-      </w:r>
-      <w:proofErr w:type="gramStart"/>
-      <w:r>
-        <w:rPr>
-          <w:color w:val="EE0000"/>
-        </w:rPr>
-        <w:t>40)*</w:t>
-      </w:r>
-      <w:proofErr w:type="gramEnd"/>
+        <w:t xml:space="preserve"> = (22/40)*0.4395 + (18/40)*</w:t>
+      </w:r>
       <w:r>
         <w:rPr>
           <w:color w:val="EE0000"/>
@@ -764,6 +550,7 @@
           <w:bCs/>
           <w:color w:val="EE0000"/>
         </w:rPr>
+        <w:lastRenderedPageBreak/>
         <w:t>Gini function</w:t>
       </w:r>
       <w:r>
@@ -812,25 +599,7 @@
           <w:bCs/>
           <w:color w:val="EE0000"/>
         </w:rPr>
-        <w:t>p^2 – (1-</w:t>
-      </w:r>
-      <w:proofErr w:type="gramStart"/>
-      <w:r>
-        <w:rPr>
-          <w:b/>
-          <w:bCs/>
-          <w:color w:val="EE0000"/>
-        </w:rPr>
-        <w:t>p)^</w:t>
-      </w:r>
-      <w:proofErr w:type="gramEnd"/>
-      <w:r>
-        <w:rPr>
-          <w:b/>
-          <w:bCs/>
-          <w:color w:val="EE0000"/>
-        </w:rPr>
-        <w:t>2</w:t>
+        <w:t>p^2 – (1-p)^2</w:t>
       </w:r>
     </w:p>
     <w:p>
@@ -852,16 +621,15 @@
           <w:bCs/>
           <w:color w:val="EE0000"/>
         </w:rPr>
-        <w:t xml:space="preserve">Entropy Function(p,1-p) </w:t>
-      </w:r>
-      <w:proofErr w:type="gramStart"/>
+        <w:t xml:space="preserve">Entropy Function(p,1-p) =  </w:t>
+      </w:r>
       <w:r>
         <w:rPr>
           <w:b/>
           <w:bCs/>
           <w:color w:val="EE0000"/>
         </w:rPr>
-        <w:t xml:space="preserve">=  </w:t>
+        <w:t>-(plog_2p</w:t>
       </w:r>
       <w:r>
         <w:rPr>
@@ -869,42 +637,7 @@
           <w:bCs/>
           <w:color w:val="EE0000"/>
         </w:rPr>
-        <w:t>-(</w:t>
-      </w:r>
-      <w:proofErr w:type="gramEnd"/>
-      <w:r>
-        <w:rPr>
-          <w:b/>
-          <w:bCs/>
-          <w:color w:val="EE0000"/>
-        </w:rPr>
-        <w:t>plog_2p</w:t>
-      </w:r>
-      <w:r>
-        <w:rPr>
-          <w:b/>
-          <w:bCs/>
-          <w:color w:val="EE0000"/>
-        </w:rPr>
-        <w:t xml:space="preserve"> + (1-</w:t>
-      </w:r>
-      <w:proofErr w:type="gramStart"/>
-      <w:r>
-        <w:rPr>
-          <w:b/>
-          <w:bCs/>
-          <w:color w:val="EE0000"/>
-        </w:rPr>
-        <w:t>p)log</w:t>
-      </w:r>
-      <w:proofErr w:type="gramEnd"/>
-      <w:r>
-        <w:rPr>
-          <w:b/>
-          <w:bCs/>
-          <w:color w:val="EE0000"/>
-        </w:rPr>
-        <w:t>_2(1-p))</w:t>
+        <w:t xml:space="preserve"> + (1-p)log_2(1-p))</w:t>
       </w:r>
     </w:p>
     <w:p>
@@ -926,25 +659,7 @@
           <w:bCs/>
           <w:color w:val="EE0000"/>
         </w:rPr>
-        <w:t>H/2 = -1/2(plog_2p + (1-</w:t>
-      </w:r>
-      <w:proofErr w:type="gramStart"/>
-      <w:r>
-        <w:rPr>
-          <w:b/>
-          <w:bCs/>
-          <w:color w:val="EE0000"/>
-        </w:rPr>
-        <w:t>p)log</w:t>
-      </w:r>
-      <w:proofErr w:type="gramEnd"/>
-      <w:r>
-        <w:rPr>
-          <w:b/>
-          <w:bCs/>
-          <w:color w:val="EE0000"/>
-        </w:rPr>
-        <w:t>_2(1-p))</w:t>
+        <w:t>H/2 = -1/2(plog_2p + (1-p)log_2(1-p))</w:t>
       </w:r>
     </w:p>
     <w:p>
@@ -1114,35 +829,31 @@
           <w:bCs/>
           <w:color w:val="EE0000"/>
         </w:rPr>
-        <w:t xml:space="preserve"> </w:t>
-      </w:r>
-      <w:proofErr w:type="spellStart"/>
-      <w:proofErr w:type="gramStart"/>
+        <w:t xml:space="preserve"> I.e, they can provide </w:t>
+      </w:r>
       <w:r>
         <w:rPr>
           <w:b/>
           <w:bCs/>
           <w:color w:val="EE0000"/>
         </w:rPr>
-        <w:t>I.e</w:t>
-      </w:r>
-      <w:proofErr w:type="spellEnd"/>
+        <w:t>distinguish</w:t>
+      </w:r>
       <w:r>
         <w:rPr>
           <w:b/>
           <w:bCs/>
           <w:color w:val="EE0000"/>
         </w:rPr>
-        <w:t>, they</w:t>
-      </w:r>
-      <w:proofErr w:type="gramEnd"/>
+        <w:t xml:space="preserve"> </w:t>
+      </w:r>
       <w:r>
         <w:rPr>
           <w:b/>
           <w:bCs/>
           <w:color w:val="EE0000"/>
         </w:rPr>
-        <w:t xml:space="preserve"> can provide </w:t>
+        <w:t>which split improves node</w:t>
       </w:r>
       <w:r>
         <w:rPr>
@@ -1150,7 +861,7 @@
           <w:bCs/>
           <w:color w:val="EE0000"/>
         </w:rPr>
-        <w:t>distinguish</w:t>
+        <w:t xml:space="preserve"> purity </w:t>
       </w:r>
       <w:r>
         <w:rPr>
@@ -1158,7 +869,7 @@
           <w:bCs/>
           <w:color w:val="EE0000"/>
         </w:rPr>
-        <w:t xml:space="preserve"> </w:t>
+        <w:t>better</w:t>
       </w:r>
       <w:r>
         <w:rPr>
@@ -1166,7 +877,7 @@
           <w:bCs/>
           <w:color w:val="EE0000"/>
         </w:rPr>
-        <w:t>which split improves node</w:t>
+        <w:t>, as seen by the curve being above misclassification error.</w:t>
       </w:r>
       <w:r>
         <w:rPr>
@@ -1174,103 +885,7 @@
           <w:bCs/>
           <w:color w:val="EE0000"/>
         </w:rPr>
-        <w:t xml:space="preserve"> purity </w:t>
-      </w:r>
-      <w:r>
-        <w:rPr>
-          <w:b/>
-          <w:bCs/>
-          <w:color w:val="EE0000"/>
-        </w:rPr>
-        <w:t>better</w:t>
-      </w:r>
-      <w:r>
-        <w:rPr>
-          <w:b/>
-          <w:bCs/>
-          <w:color w:val="EE0000"/>
-        </w:rPr>
-        <w:t>, as seen by the curve being above misclassification error.</w:t>
-      </w:r>
-      <w:r>
-        <w:rPr>
-          <w:b/>
-          <w:bCs/>
-          <w:color w:val="EE0000"/>
-        </w:rPr>
-        <w:t xml:space="preserve"> Entropy, as </w:t>
-      </w:r>
-      <w:proofErr w:type="gramStart"/>
-      <w:r>
-        <w:rPr>
-          <w:b/>
-          <w:bCs/>
-          <w:color w:val="EE0000"/>
-        </w:rPr>
-        <w:t>shown</w:t>
-      </w:r>
-      <w:proofErr w:type="gramEnd"/>
-      <w:r>
-        <w:rPr>
-          <w:b/>
-          <w:bCs/>
-          <w:color w:val="EE0000"/>
-        </w:rPr>
-        <w:t xml:space="preserve"> does tend to produce more balanced classes </w:t>
-      </w:r>
-      <w:proofErr w:type="gramStart"/>
-      <w:r>
-        <w:rPr>
-          <w:b/>
-          <w:bCs/>
-          <w:color w:val="EE0000"/>
-        </w:rPr>
-        <w:t>then</w:t>
-      </w:r>
-      <w:proofErr w:type="gramEnd"/>
-      <w:r>
-        <w:rPr>
-          <w:b/>
-          <w:bCs/>
-          <w:color w:val="EE0000"/>
-        </w:rPr>
-        <w:t xml:space="preserve"> </w:t>
-      </w:r>
-      <w:proofErr w:type="spellStart"/>
-      <w:r>
-        <w:rPr>
-          <w:b/>
-          <w:bCs/>
-          <w:color w:val="EE0000"/>
-        </w:rPr>
-        <w:t>gini</w:t>
-      </w:r>
-      <w:proofErr w:type="spellEnd"/>
-      <w:r>
-        <w:rPr>
-          <w:b/>
-          <w:bCs/>
-          <w:color w:val="EE0000"/>
-        </w:rPr>
-        <w:t xml:space="preserve">, however </w:t>
-      </w:r>
-      <w:proofErr w:type="spellStart"/>
-      <w:r>
-        <w:rPr>
-          <w:b/>
-          <w:bCs/>
-          <w:color w:val="EE0000"/>
-        </w:rPr>
-        <w:t>gini</w:t>
-      </w:r>
-      <w:proofErr w:type="spellEnd"/>
-      <w:r>
-        <w:rPr>
-          <w:b/>
-          <w:bCs/>
-          <w:color w:val="EE0000"/>
-        </w:rPr>
-        <w:t xml:space="preserve"> is faster to compute.</w:t>
+        <w:t xml:space="preserve"> Entropy, as shown does tend to produce more balanced classes then gini, however gini is faster to compute.</w:t>
       </w:r>
     </w:p>
     <w:p>
@@ -1303,7 +918,14 @@
         <w:rPr>
           <w:color w:val="EE0000"/>
         </w:rPr>
-        <w:t>showing how often the two criteria choose the same feature, I wrote an iterative function to grab the nodes of each, and a loop to compare the nodes at each level</w:t>
+        <w:t xml:space="preserve">showing how often the two </w:t>
+      </w:r>
+      <w:r>
+        <w:rPr>
+          <w:color w:val="EE0000"/>
+        </w:rPr>
+        <w:lastRenderedPageBreak/>
+        <w:t>criteria choose the same feature, I wrote an iterative function to grab the nodes of each, and a loop to compare the nodes at each level</w:t>
       </w:r>
       <w:r>
         <w:rPr>
@@ -1470,6 +1092,10 @@
     </w:p>
     <w:p>
       <w:r>
+        <w:rPr>
+          <w:noProof/>
+        </w:rPr>
+        <w:lastRenderedPageBreak/>
         <w:drawing>
           <wp:inline distT="0" distB="0" distL="0" distR="0" wp14:anchorId="08D5EBB6" wp14:editId="11C05945">
             <wp:extent cx="2086266" cy="676369"/>
@@ -1574,21 +1200,7 @@
         <w:rPr>
           <w:color w:val="EE0000"/>
         </w:rPr>
-        <w:t xml:space="preserve">random seed, just using </w:t>
-      </w:r>
-      <w:proofErr w:type="spellStart"/>
-      <w:r>
-        <w:rPr>
-          <w:color w:val="EE0000"/>
-        </w:rPr>
-        <w:t>gini</w:t>
-      </w:r>
-      <w:proofErr w:type="spellEnd"/>
-      <w:r>
-        <w:rPr>
-          <w:color w:val="EE0000"/>
-        </w:rPr>
-        <w:t xml:space="preserve"> as the criteria. I th</w:t>
+        <w:t>random seed, just using gini as the criteria. I th</w:t>
       </w:r>
       <w:r>
         <w:rPr>
@@ -1653,6 +1265,9 @@
     </w:p>
     <w:p>
       <w:r>
+        <w:rPr>
+          <w:noProof/>
+        </w:rPr>
         <w:drawing>
           <wp:inline distT="0" distB="0" distL="0" distR="0" wp14:anchorId="740F0784" wp14:editId="7FA0478A">
             <wp:extent cx="2715004" cy="323895"/>
@@ -1692,6 +1307,9 @@
     </w:p>
     <w:p>
       <w:r>
+        <w:rPr>
+          <w:noProof/>
+        </w:rPr>
         <w:drawing>
           <wp:inline distT="0" distB="0" distL="0" distR="0" wp14:anchorId="49333BD4" wp14:editId="4D8B1FB0">
             <wp:extent cx="3410426" cy="228632"/>
@@ -1758,21 +1376,8 @@
         <w:rPr>
           <w:color w:val="EE0000"/>
         </w:rPr>
-        <w:t xml:space="preserve">Trying </w:t>
-      </w:r>
-      <w:proofErr w:type="spellStart"/>
-      <w:r>
-        <w:rPr>
-          <w:color w:val="EE0000"/>
-        </w:rPr>
-        <w:t>min_samples_leaf</w:t>
-      </w:r>
-      <w:proofErr w:type="spellEnd"/>
-      <w:r>
-        <w:rPr>
-          <w:color w:val="EE0000"/>
-        </w:rPr>
-        <w:t>, we get:</w:t>
+        <w:lastRenderedPageBreak/>
+        <w:t>Trying min_samples_leaf, we get:</w:t>
       </w:r>
     </w:p>
     <w:p>
@@ -1837,6 +1442,7 @@
       </w:pPr>
       <w:r>
         <w:rPr>
+          <w:noProof/>
           <w:color w:val="EE0000"/>
         </w:rPr>
         <w:drawing>
@@ -1886,41 +1492,13 @@
         <w:rPr>
           <w:color w:val="EE0000"/>
         </w:rPr>
-        <w:t xml:space="preserve">As we can see the optimal </w:t>
-      </w:r>
-      <w:proofErr w:type="spellStart"/>
-      <w:r>
-        <w:rPr>
-          <w:color w:val="EE0000"/>
-        </w:rPr>
-        <w:t>min_samples_leaf</w:t>
-      </w:r>
-      <w:proofErr w:type="spellEnd"/>
-      <w:r>
-        <w:rPr>
-          <w:color w:val="EE0000"/>
-        </w:rPr>
-        <w:t xml:space="preserve"> also beats the best depth-limited tree, for the same reason. </w:t>
-      </w:r>
-      <w:r>
-        <w:rPr>
-          <w:color w:val="EE0000"/>
-        </w:rPr>
-        <w:t xml:space="preserve">Although it looks like 20 should be the optimal value based on the chart, </w:t>
-      </w:r>
-      <w:proofErr w:type="spellStart"/>
-      <w:r>
-        <w:rPr>
-          <w:color w:val="EE0000"/>
-        </w:rPr>
-        <w:t>GridSearch</w:t>
-      </w:r>
-      <w:proofErr w:type="spellEnd"/>
-      <w:r>
-        <w:rPr>
-          <w:color w:val="EE0000"/>
-        </w:rPr>
-        <w:t xml:space="preserve"> determined 5 was the optimal value for</w:t>
+        <w:t xml:space="preserve">As we can see the optimal min_samples_leaf also beats the best depth-limited tree, for the same reason. </w:t>
+      </w:r>
+      <w:r>
+        <w:rPr>
+          <w:color w:val="EE0000"/>
+        </w:rPr>
+        <w:t>Although it looks like 20 should be the optimal value based on the chart, GridSearch determined 5 was the optimal value for</w:t>
       </w:r>
       <w:r>
         <w:rPr>
@@ -1943,85 +1521,31 @@
           <w:bCs/>
           <w:color w:val="EE0000"/>
         </w:rPr>
-        <w:t xml:space="preserve">For both optimal values, I did not average the values over 5 runs as </w:t>
-      </w:r>
-      <w:proofErr w:type="spellStart"/>
-      <w:r>
+        <w:t>For both optimal values, I did not average the values over 5 runs as GridSearch is very compute intensive and would take my labtop ~ 1 hour to run.</w:t>
+      </w:r>
+    </w:p>
+    <w:p>
+      <w:pPr>
         <w:rPr>
           <w:b/>
           <w:bCs/>
           <w:color w:val="EE0000"/>
         </w:rPr>
-        <w:t>GridSearch</w:t>
-      </w:r>
-      <w:proofErr w:type="spellEnd"/>
+      </w:pPr>
       <w:r>
         <w:rPr>
           <w:b/>
           <w:bCs/>
           <w:color w:val="EE0000"/>
         </w:rPr>
-        <w:t xml:space="preserve"> is very compute intensive and would take my </w:t>
-      </w:r>
-      <w:proofErr w:type="spellStart"/>
+        <w:t>However, the charts show the averaged means</w:t>
+      </w:r>
       <w:r>
         <w:rPr>
           <w:b/>
           <w:bCs/>
           <w:color w:val="EE0000"/>
         </w:rPr>
-        <w:t>labtop</w:t>
-      </w:r>
-      <w:proofErr w:type="spellEnd"/>
-      <w:r>
-        <w:rPr>
-          <w:b/>
-          <w:bCs/>
-          <w:color w:val="EE0000"/>
-        </w:rPr>
-        <w:t xml:space="preserve"> ~ 1 hour to run.</w:t>
-      </w:r>
-    </w:p>
-    <w:p>
-      <w:pPr>
-        <w:rPr>
-          <w:b/>
-          <w:bCs/>
-          <w:color w:val="EE0000"/>
-        </w:rPr>
-      </w:pPr>
-      <w:r>
-        <w:rPr>
-          <w:b/>
-          <w:bCs/>
-          <w:color w:val="EE0000"/>
-        </w:rPr>
-        <w:t xml:space="preserve">However, the charts show the </w:t>
-      </w:r>
-      <w:proofErr w:type="gramStart"/>
-      <w:r>
-        <w:rPr>
-          <w:b/>
-          <w:bCs/>
-          <w:color w:val="EE0000"/>
-        </w:rPr>
-        <w:t>averaged</w:t>
-      </w:r>
-      <w:proofErr w:type="gramEnd"/>
-      <w:r>
-        <w:rPr>
-          <w:b/>
-          <w:bCs/>
-          <w:color w:val="EE0000"/>
-        </w:rPr>
-        <w:t xml:space="preserve"> means</w:t>
-      </w:r>
-      <w:r>
-        <w:rPr>
-          <w:b/>
-          <w:bCs/>
-          <w:color w:val="EE0000"/>
-        </w:rPr>
         <w:t>.</w:t>
       </w:r>
     </w:p>
@@ -2049,35 +1573,7 @@
         <w:rPr>
           <w:color w:val="EE0000"/>
         </w:rPr>
-        <w:t xml:space="preserve">creating trees using the three metrics. Notice that </w:t>
-      </w:r>
-      <w:proofErr w:type="spellStart"/>
-      <w:r>
-        <w:rPr>
-          <w:color w:val="EE0000"/>
-        </w:rPr>
-        <w:t>friedman_mse</w:t>
-      </w:r>
-      <w:proofErr w:type="spellEnd"/>
-      <w:r>
-        <w:rPr>
-          <w:color w:val="EE0000"/>
-        </w:rPr>
-        <w:t xml:space="preserve"> is deprecated now for </w:t>
-      </w:r>
-      <w:proofErr w:type="spellStart"/>
-      <w:r>
-        <w:rPr>
-          <w:color w:val="EE0000"/>
-        </w:rPr>
-        <w:t>sklearn</w:t>
-      </w:r>
-      <w:proofErr w:type="spellEnd"/>
-      <w:r>
-        <w:rPr>
-          <w:color w:val="EE0000"/>
-        </w:rPr>
-        <w:t>.</w:t>
+        <w:t>creating trees using the three metrics. Notice that friedman_mse is deprecated now for sklearn.</w:t>
       </w:r>
       <w:r>
         <w:rPr>
@@ -2089,7 +1585,14 @@
         <w:rPr>
           <w:color w:val="EE0000"/>
         </w:rPr>
-        <w:t xml:space="preserve"> Then I iterated through every metric/model and saved the one with the best validation error.</w:t>
+        <w:t xml:space="preserve"> Then I iterated through every </w:t>
+      </w:r>
+      <w:r>
+        <w:rPr>
+          <w:color w:val="EE0000"/>
+        </w:rPr>
+        <w:lastRenderedPageBreak/>
+        <w:t>metric/model and saved the one with the best validation error.</w:t>
       </w:r>
       <w:r>
         <w:rPr>
@@ -2100,6 +1603,9 @@
     </w:p>
     <w:p>
       <w:r>
+        <w:rPr>
+          <w:noProof/>
+        </w:rPr>
         <w:drawing>
           <wp:inline distT="0" distB="0" distL="0" distR="0" wp14:anchorId="62980401" wp14:editId="32833680">
             <wp:extent cx="5943600" cy="1460500"/>
@@ -2139,6 +1645,9 @@
     </w:p>
     <w:p>
       <w:r>
+        <w:rPr>
+          <w:noProof/>
+        </w:rPr>
         <w:drawing>
           <wp:inline distT="0" distB="0" distL="0" distR="0" wp14:anchorId="48F69AB6" wp14:editId="4CA785FD">
             <wp:extent cx="5943600" cy="1456690"/>
@@ -2178,6 +1687,9 @@
     </w:p>
     <w:p>
       <w:r>
+        <w:rPr>
+          <w:noProof/>
+        </w:rPr>
         <w:drawing>
           <wp:inline distT="0" distB="0" distL="0" distR="0" wp14:anchorId="3727E597" wp14:editId="05F6A31E">
             <wp:extent cx="5943600" cy="1467485"/>
@@ -2217,6 +1729,10 @@
     </w:p>
     <w:p>
       <w:r>
+        <w:rPr>
+          <w:noProof/>
+        </w:rPr>
+        <w:lastRenderedPageBreak/>
         <w:drawing>
           <wp:inline distT="0" distB="0" distL="0" distR="0" wp14:anchorId="1CA6C014" wp14:editId="360A09D8">
             <wp:extent cx="5943600" cy="3826510"/>
@@ -2256,6 +1772,9 @@
     </w:p>
     <w:p>
       <w:r>
+        <w:rPr>
+          <w:noProof/>
+        </w:rPr>
         <w:drawing>
           <wp:inline distT="0" distB="0" distL="0" distR="0" wp14:anchorId="581B414C" wp14:editId="685ED7A3">
             <wp:extent cx="5943600" cy="3761105"/>
@@ -2295,6 +1814,9 @@
     </w:p>
     <w:p>
       <w:r>
+        <w:rPr>
+          <w:noProof/>
+        </w:rPr>
         <w:drawing>
           <wp:inline distT="0" distB="0" distL="0" distR="0" wp14:anchorId="13E0DE78" wp14:editId="34C36FBF">
             <wp:extent cx="1762371" cy="238158"/>
@@ -2342,27 +1864,14 @@
         <w:rPr>
           <w:color w:val="EE0000"/>
         </w:rPr>
+        <w:lastRenderedPageBreak/>
         <w:t xml:space="preserve">As we can see </w:t>
       </w:r>
       <w:r>
         <w:rPr>
           <w:color w:val="EE0000"/>
         </w:rPr>
-        <w:t xml:space="preserve">Friedman </w:t>
-      </w:r>
-      <w:proofErr w:type="spellStart"/>
-      <w:r>
-        <w:rPr>
-          <w:color w:val="EE0000"/>
-        </w:rPr>
-        <w:t>mse</w:t>
-      </w:r>
-      <w:proofErr w:type="spellEnd"/>
-      <w:r>
-        <w:rPr>
-          <w:color w:val="EE0000"/>
-        </w:rPr>
-        <w:t xml:space="preserve"> and </w:t>
+        <w:t xml:space="preserve">Friedman mse and </w:t>
       </w:r>
       <w:r>
         <w:rPr>
@@ -2403,6 +1912,7 @@
       </w:pPr>
       <w:r>
         <w:rPr>
+          <w:noProof/>
           <w:color w:val="EE0000"/>
         </w:rPr>
         <w:drawing>
@@ -2450,6 +1960,7 @@
       </w:pPr>
       <w:r>
         <w:rPr>
+          <w:noProof/>
           <w:color w:val="EE0000"/>
         </w:rPr>
         <w:drawing>
@@ -2505,107 +2016,36 @@
         <w:rPr>
           <w:color w:val="EE0000"/>
         </w:rPr>
-        <w:t xml:space="preserve">The root and depth-1 levels are splitting based on </w:t>
-      </w:r>
-      <w:proofErr w:type="spellStart"/>
-      <w:r>
-        <w:rPr>
-          <w:color w:val="EE0000"/>
-        </w:rPr>
-        <w:t>MedInc</w:t>
-      </w:r>
-      <w:proofErr w:type="spellEnd"/>
-      <w:r>
-        <w:rPr>
-          <w:color w:val="EE0000"/>
-        </w:rPr>
-        <w:t xml:space="preserve">, which means it has the most </w:t>
-      </w:r>
-      <w:proofErr w:type="gramStart"/>
-      <w:r>
-        <w:rPr>
-          <w:color w:val="EE0000"/>
-        </w:rPr>
-        <w:t>feature</w:t>
-      </w:r>
-      <w:proofErr w:type="gramEnd"/>
-      <w:r>
-        <w:rPr>
-          <w:color w:val="EE0000"/>
-        </w:rPr>
-        <w:t xml:space="preserve"> importance and purity</w:t>
-      </w:r>
-      <w:r>
-        <w:rPr>
-          <w:color w:val="EE0000"/>
-        </w:rPr>
-        <w:t xml:space="preserve">. Further down, </w:t>
-      </w:r>
-      <w:proofErr w:type="spellStart"/>
-      <w:r>
-        <w:rPr>
-          <w:color w:val="EE0000"/>
-        </w:rPr>
-        <w:t>HouseAge</w:t>
-      </w:r>
-      <w:proofErr w:type="spellEnd"/>
-      <w:r>
-        <w:rPr>
-          <w:color w:val="EE0000"/>
-        </w:rPr>
-        <w:t xml:space="preserve">, </w:t>
-      </w:r>
-      <w:proofErr w:type="spellStart"/>
-      <w:r>
-        <w:rPr>
-          <w:color w:val="EE0000"/>
-        </w:rPr>
-        <w:t>AveRooms</w:t>
-      </w:r>
-      <w:proofErr w:type="spellEnd"/>
-      <w:r>
-        <w:rPr>
-          <w:color w:val="EE0000"/>
-        </w:rPr>
-        <w:t xml:space="preserve">, </w:t>
-      </w:r>
-      <w:proofErr w:type="spellStart"/>
-      <w:r>
-        <w:rPr>
-          <w:color w:val="EE0000"/>
-        </w:rPr>
-        <w:t>AveOccup</w:t>
-      </w:r>
-      <w:proofErr w:type="spellEnd"/>
-      <w:r>
-        <w:rPr>
-          <w:color w:val="EE0000"/>
-        </w:rPr>
-        <w:t xml:space="preserve">, and Population start to be considered. This is to be </w:t>
-      </w:r>
-      <w:proofErr w:type="gramStart"/>
-      <w:r>
-        <w:rPr>
-          <w:color w:val="EE0000"/>
-        </w:rPr>
-        <w:t>expected,</w:t>
-      </w:r>
-      <w:proofErr w:type="gramEnd"/>
-      <w:r>
-        <w:rPr>
-          <w:color w:val="EE0000"/>
-        </w:rPr>
-        <w:t xml:space="preserve"> we should not be seeing the Latitude or Longitude near the top of the tree.</w:t>
-      </w:r>
-    </w:p>
-    <w:p>
-      <w:pPr>
-        <w:rPr>
-          <w:color w:val="EE0000"/>
-        </w:rPr>
-      </w:pPr>
-      <w:r>
-        <w:rPr>
+        <w:t>The root and depth-1 levels are splitting based on MedInc</w:t>
+      </w:r>
+      <w:r>
+        <w:rPr>
+          <w:color w:val="EE0000"/>
+        </w:rPr>
+        <w:t>, which means it has the most feature importance and purity</w:t>
+      </w:r>
+      <w:r>
+        <w:rPr>
+          <w:color w:val="EE0000"/>
+        </w:rPr>
+        <w:t>. Further down, HouseAge, AveRooms</w:t>
+      </w:r>
+      <w:r>
+        <w:rPr>
+          <w:color w:val="EE0000"/>
+        </w:rPr>
+        <w:t>, AveOccup, and Population start to be considered. This is to be expected, we should not be seeing the Latitude or Longitude near the top of the tree.</w:t>
+      </w:r>
+    </w:p>
+    <w:p>
+      <w:pPr>
+        <w:rPr>
+          <w:color w:val="EE0000"/>
+        </w:rPr>
+      </w:pPr>
+      <w:r>
+        <w:rPr>
+          <w:noProof/>
           <w:color w:val="EE0000"/>
         </w:rPr>
         <w:drawing>
@@ -2655,6 +2095,7 @@
         <w:rPr>
           <w:color w:val="EE0000"/>
         </w:rPr>
+        <w:lastRenderedPageBreak/>
         <w:t xml:space="preserve">This shows the step-function (piecewise) behavior of the </w:t>
       </w:r>
       <w:r>
@@ -2864,9 +2305,31 @@
         <w:t>2b</w:t>
       </w:r>
     </w:p>
+    <w:p>
+      <w:pPr>
+        <w:rPr>
+          <w:color w:val="EE0000"/>
+        </w:rPr>
+      </w:pPr>
+      <w:r>
+        <w:rPr>
+          <w:color w:val="EE0000"/>
+        </w:rPr>
+        <w:t xml:space="preserve">I started by training the bagging classifier by using n_estimators = </w:t>
+      </w:r>
+      <w:r>
+        <w:rPr>
+          <w:color w:val="EE0000"/>
+        </w:rPr>
+        <w:t>[1,25,50,100,200,300] then collecting validation accuracy and oob score.</w:t>
+      </w:r>
+    </w:p>
     <w:p/>
     <w:p>
       <w:r>
+        <w:rPr>
+          <w:noProof/>
+        </w:rPr>
         <w:lastRenderedPageBreak/>
         <w:drawing>
           <wp:inline distT="0" distB="0" distL="0" distR="0" wp14:anchorId="61595D2C" wp14:editId="3C58452A">
@@ -2907,6 +2370,49 @@
     </w:p>
     <w:p>
       <w:pPr>
+        <w:rPr>
+          <w:color w:val="EE0000"/>
+        </w:rPr>
+      </w:pPr>
+      <w:r>
+        <w:rPr>
+          <w:color w:val="EE0000"/>
+        </w:rPr>
+        <w:t>The validation accuracy and OOB estimate are</w:t>
+      </w:r>
+      <w:r>
+        <w:rPr>
+          <w:color w:val="EE0000"/>
+        </w:rPr>
+        <w:t xml:space="preserve"> very close</w:t>
+      </w:r>
+      <w:r>
+        <w:rPr>
+          <w:color w:val="EE0000"/>
+        </w:rPr>
+        <w:t>,</w:t>
+      </w:r>
+      <w:r>
+        <w:rPr>
+          <w:color w:val="EE0000"/>
+        </w:rPr>
+        <w:t xml:space="preserve"> both estimate how well the model generalizes to unseen data</w:t>
+      </w:r>
+      <w:r>
+        <w:rPr>
+          <w:color w:val="EE0000"/>
+        </w:rPr>
+        <w:t>. Pasting does not have one because it samples, without replacement</w:t>
+      </w:r>
+      <w:r>
+        <w:rPr>
+          <w:color w:val="EE0000"/>
+        </w:rPr>
+        <w:t>, so it will use every sample from the subset.</w:t>
+      </w:r>
+    </w:p>
+    <w:p>
+      <w:pPr>
         <w:pStyle w:val="Heading2"/>
       </w:pPr>
       <w:r>
@@ -2914,7 +2420,36 @@
       </w:r>
     </w:p>
     <w:p>
-      <w:r>
+      <w:pPr>
+        <w:rPr>
+          <w:color w:val="EE0000"/>
+        </w:rPr>
+      </w:pPr>
+      <w:r>
+        <w:rPr>
+          <w:color w:val="EE0000"/>
+        </w:rPr>
+        <w:t xml:space="preserve">I </w:t>
+      </w:r>
+      <w:r>
+        <w:rPr>
+          <w:color w:val="EE0000"/>
+        </w:rPr>
+        <w:t>got 10 different bootstrap resamples from the data and then collected the predictions for each model, I then compared them using a bar chart</w:t>
+      </w:r>
+      <w:r>
+        <w:rPr>
+          <w:color w:val="EE0000"/>
+        </w:rPr>
+        <w:t>.</w:t>
+      </w:r>
+    </w:p>
+    <w:p>
+      <w:r>
+        <w:rPr>
+          <w:noProof/>
+        </w:rPr>
+        <w:lastRenderedPageBreak/>
         <w:drawing>
           <wp:inline distT="0" distB="0" distL="0" distR="0" wp14:anchorId="35488025" wp14:editId="3968DE3D">
             <wp:extent cx="4534533" cy="3381847"/>
@@ -2955,18 +2490,52 @@
     <w:p>
       <w:pPr>
         <w:pStyle w:val="Heading2"/>
+        <w:tabs>
+          <w:tab w:val="left" w:pos="1260"/>
+        </w:tabs>
       </w:pPr>
       <w:r>
         <w:t>2d</w:t>
       </w:r>
-    </w:p>
-    <w:p>
-      <w:r>
+      <w:r>
+        <w:tab/>
+      </w:r>
+    </w:p>
+    <w:p>
+      <w:pPr>
+        <w:rPr>
+          <w:color w:val="EE0000"/>
+        </w:rPr>
+      </w:pPr>
+      <w:r>
+        <w:rPr>
+          <w:color w:val="EE0000"/>
+        </w:rPr>
+        <w:t xml:space="preserve">I began by sweeping through the fractions and training the models. For random patches, to show on a table I had to </w:t>
+      </w:r>
+      <w:r>
+        <w:rPr>
+          <w:color w:val="EE0000"/>
+        </w:rPr>
+        <w:t>average the stats by fixing row and column.</w:t>
+      </w:r>
+      <w:r>
+        <w:rPr>
+          <w:color w:val="EE0000"/>
+        </w:rPr>
+        <w:t xml:space="preserve"> The heatmap will show the best accuracies for each row and column fraction anyway.</w:t>
+      </w:r>
+    </w:p>
+    <w:p>
+      <w:r>
+        <w:rPr>
+          <w:noProof/>
+        </w:rPr>
         <w:drawing>
-          <wp:inline distT="0" distB="0" distL="0" distR="0" wp14:anchorId="490E0D96" wp14:editId="284E4FA8">
-            <wp:extent cx="5943600" cy="275590"/>
+          <wp:inline distT="0" distB="0" distL="0" distR="0" wp14:anchorId="34382F70" wp14:editId="1B017FB9">
+            <wp:extent cx="5943600" cy="839470"/>
             <wp:effectExtent l="0" t="0" r="0" b="0"/>
-            <wp:docPr id="672525604" name="Picture 1"/>
+            <wp:docPr id="68054835" name="Picture 3"/>
             <wp:cNvGraphicFramePr>
               <a:graphicFrameLocks xmlns:a="http://schemas.openxmlformats.org/drawingml/2006/main" noChangeAspect="1"/>
             </wp:cNvGraphicFramePr>
@@ -2974,11 +2543,17 @@
               <a:graphicData uri="http://schemas.openxmlformats.org/drawingml/2006/picture">
                 <pic:pic xmlns:pic="http://schemas.openxmlformats.org/drawingml/2006/picture">
                   <pic:nvPicPr>
-                    <pic:cNvPr id="672525604" name=""/>
+                    <pic:cNvPr id="68054835" name="Picture 68054835"/>
                     <pic:cNvPicPr/>
                   </pic:nvPicPr>
                   <pic:blipFill>
-                    <a:blip r:embed="rId29"/>
+                    <a:blip r:embed="rId29" cstate="print">
+                      <a:extLst>
+                        <a:ext uri="{28A0092B-C50C-407E-A947-70E740481C1C}">
+                          <a14:useLocalDpi xmlns:a14="http://schemas.microsoft.com/office/drawing/2010/main" val="0"/>
+                        </a:ext>
+                      </a:extLst>
+                    </a:blip>
                     <a:stretch>
                       <a:fillRect/>
                     </a:stretch>
@@ -2986,7 +2561,7 @@
                   <pic:spPr>
                     <a:xfrm>
                       <a:off x="0" y="0"/>
-                      <a:ext cx="5943600" cy="275590"/>
+                      <a:ext cx="5943600" cy="839470"/>
                     </a:xfrm>
                     <a:prstGeom prst="rect">
                       <a:avLst/>
@@ -3001,6 +2576,57 @@
     </w:p>
     <w:p>
       <w:r>
+        <w:rPr>
+          <w:noProof/>
+        </w:rPr>
+        <w:drawing>
+          <wp:inline distT="0" distB="0" distL="0" distR="0" wp14:anchorId="3A6453DF" wp14:editId="074C15DD">
+            <wp:extent cx="5943600" cy="839470"/>
+            <wp:effectExtent l="0" t="0" r="0" b="0"/>
+            <wp:docPr id="1181571919" name="Picture 4"/>
+            <wp:cNvGraphicFramePr>
+              <a:graphicFrameLocks xmlns:a="http://schemas.openxmlformats.org/drawingml/2006/main" noChangeAspect="1"/>
+            </wp:cNvGraphicFramePr>
+            <a:graphic xmlns:a="http://schemas.openxmlformats.org/drawingml/2006/main">
+              <a:graphicData uri="http://schemas.openxmlformats.org/drawingml/2006/picture">
+                <pic:pic xmlns:pic="http://schemas.openxmlformats.org/drawingml/2006/picture">
+                  <pic:nvPicPr>
+                    <pic:cNvPr id="1181571919" name="Picture 1181571919"/>
+                    <pic:cNvPicPr/>
+                  </pic:nvPicPr>
+                  <pic:blipFill>
+                    <a:blip r:embed="rId30" cstate="print">
+                      <a:extLst>
+                        <a:ext uri="{28A0092B-C50C-407E-A947-70E740481C1C}">
+                          <a14:useLocalDpi xmlns:a14="http://schemas.microsoft.com/office/drawing/2010/main" val="0"/>
+                        </a:ext>
+                      </a:extLst>
+                    </a:blip>
+                    <a:stretch>
+                      <a:fillRect/>
+                    </a:stretch>
+                  </pic:blipFill>
+                  <pic:spPr>
+                    <a:xfrm>
+                      <a:off x="0" y="0"/>
+                      <a:ext cx="5943600" cy="839470"/>
+                    </a:xfrm>
+                    <a:prstGeom prst="rect">
+                      <a:avLst/>
+                    </a:prstGeom>
+                  </pic:spPr>
+                </pic:pic>
+              </a:graphicData>
+            </a:graphic>
+          </wp:inline>
+        </w:drawing>
+      </w:r>
+    </w:p>
+    <w:p>
+      <w:r>
+        <w:rPr>
+          <w:noProof/>
+        </w:rPr>
         <w:lastRenderedPageBreak/>
         <w:drawing>
           <wp:inline distT="0" distB="0" distL="0" distR="0" wp14:anchorId="234DEC18" wp14:editId="7F670A97">
@@ -3018,7 +2644,7 @@
                     <pic:cNvPicPr/>
                   </pic:nvPicPr>
                   <pic:blipFill>
-                    <a:blip r:embed="rId30"/>
+                    <a:blip r:embed="rId31"/>
                     <a:stretch>
                       <a:fillRect/>
                     </a:stretch>
@@ -3039,10 +2665,730 @@
         </w:drawing>
       </w:r>
     </w:p>
+    <w:p>
+      <w:pPr>
+        <w:rPr>
+          <w:color w:val="EE0000"/>
+        </w:rPr>
+      </w:pPr>
+      <w:r>
+        <w:rPr>
+          <w:color w:val="EE0000"/>
+        </w:rPr>
+        <w:t>Shallow trees have high bias but lower variance, i.e they underfit</w:t>
+      </w:r>
+      <w:r>
+        <w:rPr>
+          <w:color w:val="EE0000"/>
+        </w:rPr>
+        <w:t xml:space="preserve">, so bagging does little since it reduces variance. However for deep trees, which have </w:t>
+      </w:r>
+      <w:r>
+        <w:rPr>
+          <w:color w:val="EE0000"/>
+        </w:rPr>
+        <w:t>higher bias, bagging can help reduce the variance which improves their performance a lot more.</w:t>
+      </w:r>
+    </w:p>
+    <w:p>
+      <w:pPr>
+        <w:pStyle w:val="Heading1"/>
+      </w:pPr>
+      <w:r>
+        <w:t>Part 3 – Random Forests and Extra Trees</w:t>
+      </w:r>
+    </w:p>
+    <w:p>
+      <w:pPr>
+        <w:pStyle w:val="Heading2"/>
+      </w:pPr>
+      <w:r>
+        <w:t>3a</w:t>
+      </w:r>
+    </w:p>
+    <w:p>
+      <w:pPr>
+        <w:rPr>
+          <w:color w:val="EE0000"/>
+        </w:rPr>
+      </w:pPr>
+      <w:r>
+        <w:rPr>
+          <w:color w:val="EE0000"/>
+        </w:rPr>
+        <w:t xml:space="preserve">I started by sweeping the max features and random seeds for random forests on entropy vs gini and extra trees entropy and gini for fair comparison across all. I then </w:t>
+      </w:r>
+      <w:r>
+        <w:rPr>
+          <w:color w:val="EE0000"/>
+        </w:rPr>
+        <w:t>created the graphics to compare them.</w:t>
+      </w:r>
+    </w:p>
+    <w:p>
+      <w:pPr>
+        <w:rPr>
+          <w:color w:val="EE0000"/>
+        </w:rPr>
+      </w:pPr>
+      <w:r>
+        <w:rPr>
+          <w:noProof/>
+          <w:color w:val="EE0000"/>
+        </w:rPr>
+        <w:drawing>
+          <wp:inline distT="0" distB="0" distL="0" distR="0" wp14:anchorId="5BB21ACF" wp14:editId="3A24F03E">
+            <wp:extent cx="5943600" cy="843280"/>
+            <wp:effectExtent l="0" t="0" r="0" b="0"/>
+            <wp:docPr id="939179344" name="Picture 5"/>
+            <wp:cNvGraphicFramePr>
+              <a:graphicFrameLocks xmlns:a="http://schemas.openxmlformats.org/drawingml/2006/main" noChangeAspect="1"/>
+            </wp:cNvGraphicFramePr>
+            <a:graphic xmlns:a="http://schemas.openxmlformats.org/drawingml/2006/main">
+              <a:graphicData uri="http://schemas.openxmlformats.org/drawingml/2006/picture">
+                <pic:pic xmlns:pic="http://schemas.openxmlformats.org/drawingml/2006/picture">
+                  <pic:nvPicPr>
+                    <pic:cNvPr id="939179344" name="Picture 939179344"/>
+                    <pic:cNvPicPr/>
+                  </pic:nvPicPr>
+                  <pic:blipFill>
+                    <a:blip r:embed="rId32" cstate="print">
+                      <a:extLst>
+                        <a:ext uri="{28A0092B-C50C-407E-A947-70E740481C1C}">
+                          <a14:useLocalDpi xmlns:a14="http://schemas.microsoft.com/office/drawing/2010/main" val="0"/>
+                        </a:ext>
+                      </a:extLst>
+                    </a:blip>
+                    <a:stretch>
+                      <a:fillRect/>
+                    </a:stretch>
+                  </pic:blipFill>
+                  <pic:spPr>
+                    <a:xfrm>
+                      <a:off x="0" y="0"/>
+                      <a:ext cx="5943600" cy="843280"/>
+                    </a:xfrm>
+                    <a:prstGeom prst="rect">
+                      <a:avLst/>
+                    </a:prstGeom>
+                  </pic:spPr>
+                </pic:pic>
+              </a:graphicData>
+            </a:graphic>
+          </wp:inline>
+        </w:drawing>
+      </w:r>
+    </w:p>
+    <w:p>
+      <w:pPr>
+        <w:rPr>
+          <w:color w:val="EE0000"/>
+        </w:rPr>
+      </w:pPr>
+      <w:r>
+        <w:rPr>
+          <w:noProof/>
+          <w:color w:val="EE0000"/>
+        </w:rPr>
+        <w:lastRenderedPageBreak/>
+        <w:drawing>
+          <wp:inline distT="0" distB="0" distL="0" distR="0" wp14:anchorId="3E49DDCB" wp14:editId="377D9678">
+            <wp:extent cx="5340107" cy="4160528"/>
+            <wp:effectExtent l="0" t="0" r="0" b="0"/>
+            <wp:docPr id="1249246914" name="Picture 7"/>
+            <wp:cNvGraphicFramePr>
+              <a:graphicFrameLocks xmlns:a="http://schemas.openxmlformats.org/drawingml/2006/main" noChangeAspect="1"/>
+            </wp:cNvGraphicFramePr>
+            <a:graphic xmlns:a="http://schemas.openxmlformats.org/drawingml/2006/main">
+              <a:graphicData uri="http://schemas.openxmlformats.org/drawingml/2006/picture">
+                <pic:pic xmlns:pic="http://schemas.openxmlformats.org/drawingml/2006/picture">
+                  <pic:nvPicPr>
+                    <pic:cNvPr id="1249246914" name="Picture 1249246914"/>
+                    <pic:cNvPicPr/>
+                  </pic:nvPicPr>
+                  <pic:blipFill>
+                    <a:blip r:embed="rId33">
+                      <a:extLst>
+                        <a:ext uri="{28A0092B-C50C-407E-A947-70E740481C1C}">
+                          <a14:useLocalDpi xmlns:a14="http://schemas.microsoft.com/office/drawing/2010/main" val="0"/>
+                        </a:ext>
+                      </a:extLst>
+                    </a:blip>
+                    <a:stretch>
+                      <a:fillRect/>
+                    </a:stretch>
+                  </pic:blipFill>
+                  <pic:spPr>
+                    <a:xfrm>
+                      <a:off x="0" y="0"/>
+                      <a:ext cx="5340107" cy="4160528"/>
+                    </a:xfrm>
+                    <a:prstGeom prst="rect">
+                      <a:avLst/>
+                    </a:prstGeom>
+                  </pic:spPr>
+                </pic:pic>
+              </a:graphicData>
+            </a:graphic>
+          </wp:inline>
+        </w:drawing>
+      </w:r>
+    </w:p>
+    <w:p>
+      <w:pPr>
+        <w:rPr>
+          <w:color w:val="EE0000"/>
+        </w:rPr>
+      </w:pPr>
+      <w:r>
+        <w:rPr>
+          <w:noProof/>
+          <w:color w:val="EE0000"/>
+        </w:rPr>
+        <w:lastRenderedPageBreak/>
+        <w:drawing>
+          <wp:inline distT="0" distB="0" distL="0" distR="0" wp14:anchorId="5E500E6B" wp14:editId="4BE98204">
+            <wp:extent cx="5138938" cy="4160528"/>
+            <wp:effectExtent l="0" t="0" r="5080" b="0"/>
+            <wp:docPr id="320170557" name="Picture 6"/>
+            <wp:cNvGraphicFramePr>
+              <a:graphicFrameLocks xmlns:a="http://schemas.openxmlformats.org/drawingml/2006/main" noChangeAspect="1"/>
+            </wp:cNvGraphicFramePr>
+            <a:graphic xmlns:a="http://schemas.openxmlformats.org/drawingml/2006/main">
+              <a:graphicData uri="http://schemas.openxmlformats.org/drawingml/2006/picture">
+                <pic:pic xmlns:pic="http://schemas.openxmlformats.org/drawingml/2006/picture">
+                  <pic:nvPicPr>
+                    <pic:cNvPr id="320170557" name="Picture 320170557"/>
+                    <pic:cNvPicPr/>
+                  </pic:nvPicPr>
+                  <pic:blipFill>
+                    <a:blip r:embed="rId34">
+                      <a:extLst>
+                        <a:ext uri="{28A0092B-C50C-407E-A947-70E740481C1C}">
+                          <a14:useLocalDpi xmlns:a14="http://schemas.microsoft.com/office/drawing/2010/main" val="0"/>
+                        </a:ext>
+                      </a:extLst>
+                    </a:blip>
+                    <a:stretch>
+                      <a:fillRect/>
+                    </a:stretch>
+                  </pic:blipFill>
+                  <pic:spPr>
+                    <a:xfrm>
+                      <a:off x="0" y="0"/>
+                      <a:ext cx="5138938" cy="4160528"/>
+                    </a:xfrm>
+                    <a:prstGeom prst="rect">
+                      <a:avLst/>
+                    </a:prstGeom>
+                  </pic:spPr>
+                </pic:pic>
+              </a:graphicData>
+            </a:graphic>
+          </wp:inline>
+        </w:drawing>
+      </w:r>
+    </w:p>
+    <w:p>
+      <w:pPr>
+        <w:rPr>
+          <w:color w:val="EE0000"/>
+        </w:rPr>
+      </w:pPr>
+      <w:r>
+        <w:rPr>
+          <w:color w:val="EE0000"/>
+        </w:rPr>
+        <w:t xml:space="preserve">As we can see the initial </w:t>
+      </w:r>
+      <w:r>
+        <w:rPr>
+          <w:color w:val="EE0000"/>
+        </w:rPr>
+        <w:t>values of Max Features result with an increase in validation accuracies which diminish as the hyperparameter increase. Also to be noted is that entropy does result in slightly better accuracy at the cost of slightly longer training times.</w:t>
+      </w:r>
+    </w:p>
+    <w:p>
+      <w:pPr>
+        <w:pStyle w:val="Heading2"/>
+      </w:pPr>
+      <w:r>
+        <w:t>3b</w:t>
+      </w:r>
+    </w:p>
+    <w:p>
+      <w:pPr>
+        <w:rPr>
+          <w:color w:val="EE0000"/>
+        </w:rPr>
+      </w:pPr>
+      <w:r>
+        <w:rPr>
+          <w:color w:val="EE0000"/>
+        </w:rPr>
+        <w:t xml:space="preserve">Using the statistics obtained from 3a’s process I just created the graphics to compare random forest vs </w:t>
+      </w:r>
+      <w:r>
+        <w:rPr>
+          <w:color w:val="EE0000"/>
+        </w:rPr>
+        <w:t>extra trees across 5 seeds.</w:t>
+      </w:r>
+    </w:p>
+    <w:p>
+      <w:pPr>
+        <w:rPr>
+          <w:color w:val="EE0000"/>
+        </w:rPr>
+      </w:pPr>
+      <w:r>
+        <w:rPr>
+          <w:noProof/>
+          <w:color w:val="EE0000"/>
+        </w:rPr>
+        <w:drawing>
+          <wp:inline distT="0" distB="0" distL="0" distR="0" wp14:anchorId="34A0C2CE" wp14:editId="5EB883C3">
+            <wp:extent cx="5943600" cy="843280"/>
+            <wp:effectExtent l="0" t="0" r="0" b="0"/>
+            <wp:docPr id="1575004341" name="Picture 11"/>
+            <wp:cNvGraphicFramePr>
+              <a:graphicFrameLocks xmlns:a="http://schemas.openxmlformats.org/drawingml/2006/main" noChangeAspect="1"/>
+            </wp:cNvGraphicFramePr>
+            <a:graphic xmlns:a="http://schemas.openxmlformats.org/drawingml/2006/main">
+              <a:graphicData uri="http://schemas.openxmlformats.org/drawingml/2006/picture">
+                <pic:pic xmlns:pic="http://schemas.openxmlformats.org/drawingml/2006/picture">
+                  <pic:nvPicPr>
+                    <pic:cNvPr id="1575004341" name="Picture 1575004341"/>
+                    <pic:cNvPicPr/>
+                  </pic:nvPicPr>
+                  <pic:blipFill>
+                    <a:blip r:embed="rId35" cstate="print">
+                      <a:extLst>
+                        <a:ext uri="{28A0092B-C50C-407E-A947-70E740481C1C}">
+                          <a14:useLocalDpi xmlns:a14="http://schemas.microsoft.com/office/drawing/2010/main" val="0"/>
+                        </a:ext>
+                      </a:extLst>
+                    </a:blip>
+                    <a:stretch>
+                      <a:fillRect/>
+                    </a:stretch>
+                  </pic:blipFill>
+                  <pic:spPr>
+                    <a:xfrm>
+                      <a:off x="0" y="0"/>
+                      <a:ext cx="5943600" cy="843280"/>
+                    </a:xfrm>
+                    <a:prstGeom prst="rect">
+                      <a:avLst/>
+                    </a:prstGeom>
+                  </pic:spPr>
+                </pic:pic>
+              </a:graphicData>
+            </a:graphic>
+          </wp:inline>
+        </w:drawing>
+      </w:r>
+    </w:p>
+    <w:p>
+      <w:pPr>
+        <w:rPr>
+          <w:color w:val="EE0000"/>
+        </w:rPr>
+      </w:pPr>
+    </w:p>
+    <w:p>
+      <w:pPr>
+        <w:rPr>
+          <w:noProof/>
+        </w:rPr>
+      </w:pPr>
+    </w:p>
+    <w:p>
+      <w:r>
+        <w:rPr>
+          <w:noProof/>
+        </w:rPr>
+        <w:lastRenderedPageBreak/>
+        <w:drawing>
+          <wp:inline distT="0" distB="0" distL="0" distR="0" wp14:anchorId="78B9D7AF" wp14:editId="3DA8A63A">
+            <wp:extent cx="5340107" cy="4160528"/>
+            <wp:effectExtent l="0" t="0" r="0" b="0"/>
+            <wp:docPr id="1883119061" name="Picture 9"/>
+            <wp:cNvGraphicFramePr>
+              <a:graphicFrameLocks xmlns:a="http://schemas.openxmlformats.org/drawingml/2006/main" noChangeAspect="1"/>
+            </wp:cNvGraphicFramePr>
+            <a:graphic xmlns:a="http://schemas.openxmlformats.org/drawingml/2006/main">
+              <a:graphicData uri="http://schemas.openxmlformats.org/drawingml/2006/picture">
+                <pic:pic xmlns:pic="http://schemas.openxmlformats.org/drawingml/2006/picture">
+                  <pic:nvPicPr>
+                    <pic:cNvPr id="1883119061" name="Picture 1883119061"/>
+                    <pic:cNvPicPr/>
+                  </pic:nvPicPr>
+                  <pic:blipFill>
+                    <a:blip r:embed="rId36">
+                      <a:extLst>
+                        <a:ext uri="{28A0092B-C50C-407E-A947-70E740481C1C}">
+                          <a14:useLocalDpi xmlns:a14="http://schemas.microsoft.com/office/drawing/2010/main" val="0"/>
+                        </a:ext>
+                      </a:extLst>
+                    </a:blip>
+                    <a:stretch>
+                      <a:fillRect/>
+                    </a:stretch>
+                  </pic:blipFill>
+                  <pic:spPr>
+                    <a:xfrm>
+                      <a:off x="0" y="0"/>
+                      <a:ext cx="5340107" cy="4160528"/>
+                    </a:xfrm>
+                    <a:prstGeom prst="rect">
+                      <a:avLst/>
+                    </a:prstGeom>
+                  </pic:spPr>
+                </pic:pic>
+              </a:graphicData>
+            </a:graphic>
+          </wp:inline>
+        </w:drawing>
+      </w:r>
+    </w:p>
+    <w:p>
+      <w:pPr>
+        <w:rPr>
+          <w:color w:val="EE0000"/>
+        </w:rPr>
+      </w:pPr>
+      <w:r>
+        <w:rPr>
+          <w:color w:val="EE0000"/>
+        </w:rPr>
+        <w:t xml:space="preserve">The extra trees seems to perform better </w:t>
+      </w:r>
+    </w:p>
+    <w:p>
+      <w:r>
+        <w:rPr>
+          <w:noProof/>
+        </w:rPr>
+        <w:lastRenderedPageBreak/>
+        <w:drawing>
+          <wp:inline distT="0" distB="0" distL="0" distR="0" wp14:anchorId="17E6E464" wp14:editId="0FD48F32">
+            <wp:extent cx="5138938" cy="4160528"/>
+            <wp:effectExtent l="0" t="0" r="5080" b="0"/>
+            <wp:docPr id="891448932" name="Picture 10"/>
+            <wp:cNvGraphicFramePr>
+              <a:graphicFrameLocks xmlns:a="http://schemas.openxmlformats.org/drawingml/2006/main" noChangeAspect="1"/>
+            </wp:cNvGraphicFramePr>
+            <a:graphic xmlns:a="http://schemas.openxmlformats.org/drawingml/2006/main">
+              <a:graphicData uri="http://schemas.openxmlformats.org/drawingml/2006/picture">
+                <pic:pic xmlns:pic="http://schemas.openxmlformats.org/drawingml/2006/picture">
+                  <pic:nvPicPr>
+                    <pic:cNvPr id="891448932" name="Picture 891448932"/>
+                    <pic:cNvPicPr/>
+                  </pic:nvPicPr>
+                  <pic:blipFill>
+                    <a:blip r:embed="rId37">
+                      <a:extLst>
+                        <a:ext uri="{28A0092B-C50C-407E-A947-70E740481C1C}">
+                          <a14:useLocalDpi xmlns:a14="http://schemas.microsoft.com/office/drawing/2010/main" val="0"/>
+                        </a:ext>
+                      </a:extLst>
+                    </a:blip>
+                    <a:stretch>
+                      <a:fillRect/>
+                    </a:stretch>
+                  </pic:blipFill>
+                  <pic:spPr>
+                    <a:xfrm>
+                      <a:off x="0" y="0"/>
+                      <a:ext cx="5138938" cy="4160528"/>
+                    </a:xfrm>
+                    <a:prstGeom prst="rect">
+                      <a:avLst/>
+                    </a:prstGeom>
+                  </pic:spPr>
+                </pic:pic>
+              </a:graphicData>
+            </a:graphic>
+          </wp:inline>
+        </w:drawing>
+      </w:r>
+    </w:p>
+    <w:p>
+      <w:pPr>
+        <w:rPr>
+          <w:color w:val="EE0000"/>
+        </w:rPr>
+      </w:pPr>
+      <w:r>
+        <w:rPr>
+          <w:color w:val="EE0000"/>
+        </w:rPr>
+        <w:t>The extra trees perform</w:t>
+      </w:r>
+      <w:r>
+        <w:rPr>
+          <w:color w:val="EE0000"/>
+        </w:rPr>
+        <w:t>s</w:t>
+      </w:r>
+      <w:r>
+        <w:rPr>
+          <w:color w:val="EE0000"/>
+        </w:rPr>
+        <w:t xml:space="preserve"> better </w:t>
+      </w:r>
+      <w:r>
+        <w:rPr>
+          <w:color w:val="EE0000"/>
+        </w:rPr>
+        <w:t>across both accuracy and train</w:t>
+      </w:r>
+      <w:r>
+        <w:rPr>
+          <w:color w:val="EE0000"/>
+        </w:rPr>
+        <w:t>ing time, with similar variance if we compare the table in 3b to 3a.</w:t>
+      </w:r>
+    </w:p>
+    <w:p>
+      <w:pPr>
+        <w:pStyle w:val="Heading2"/>
+      </w:pPr>
+      <w:r>
+        <w:t>3c</w:t>
+      </w:r>
+    </w:p>
+    <w:p>
+      <w:pPr>
+        <w:rPr>
+          <w:color w:val="EE0000"/>
+        </w:rPr>
+      </w:pPr>
+      <w:r>
+        <w:rPr>
+          <w:color w:val="EE0000"/>
+        </w:rPr>
+        <w:t>For the classification I used the best model, extratrees, with entropy and max features set to 200. For regression, beca</w:t>
+      </w:r>
+      <w:r>
+        <w:rPr>
+          <w:color w:val="EE0000"/>
+        </w:rPr>
+        <w:t>use there is no previous results I used extratrees and squared error</w:t>
+      </w:r>
+      <w:r>
+        <w:rPr>
+          <w:color w:val="EE0000"/>
+        </w:rPr>
+        <w:t>. I then used sklearn’s permutation importance and .feature_importances_ to obtain those, and then I created the plots.</w:t>
+      </w:r>
+    </w:p>
+    <w:p>
+      <w:r>
+        <w:rPr>
+          <w:noProof/>
+        </w:rPr>
+        <w:lastRenderedPageBreak/>
+        <w:drawing>
+          <wp:inline distT="0" distB="0" distL="0" distR="0" wp14:anchorId="2AD9C8A4" wp14:editId="0C71019B">
+            <wp:extent cx="5943600" cy="4951730"/>
+            <wp:effectExtent l="0" t="0" r="0" b="1270"/>
+            <wp:docPr id="173694524" name="Picture 12"/>
+            <wp:cNvGraphicFramePr>
+              <a:graphicFrameLocks xmlns:a="http://schemas.openxmlformats.org/drawingml/2006/main" noChangeAspect="1"/>
+            </wp:cNvGraphicFramePr>
+            <a:graphic xmlns:a="http://schemas.openxmlformats.org/drawingml/2006/main">
+              <a:graphicData uri="http://schemas.openxmlformats.org/drawingml/2006/picture">
+                <pic:pic xmlns:pic="http://schemas.openxmlformats.org/drawingml/2006/picture">
+                  <pic:nvPicPr>
+                    <pic:cNvPr id="173694524" name="Picture 173694524"/>
+                    <pic:cNvPicPr/>
+                  </pic:nvPicPr>
+                  <pic:blipFill>
+                    <a:blip r:embed="rId38">
+                      <a:extLst>
+                        <a:ext uri="{28A0092B-C50C-407E-A947-70E740481C1C}">
+                          <a14:useLocalDpi xmlns:a14="http://schemas.microsoft.com/office/drawing/2010/main" val="0"/>
+                        </a:ext>
+                      </a:extLst>
+                    </a:blip>
+                    <a:stretch>
+                      <a:fillRect/>
+                    </a:stretch>
+                  </pic:blipFill>
+                  <pic:spPr>
+                    <a:xfrm>
+                      <a:off x="0" y="0"/>
+                      <a:ext cx="5943600" cy="4951730"/>
+                    </a:xfrm>
+                    <a:prstGeom prst="rect">
+                      <a:avLst/>
+                    </a:prstGeom>
+                  </pic:spPr>
+                </pic:pic>
+              </a:graphicData>
+            </a:graphic>
+          </wp:inline>
+        </w:drawing>
+      </w:r>
+    </w:p>
+    <w:p>
+      <w:r>
+        <w:rPr>
+          <w:noProof/>
+        </w:rPr>
+        <w:lastRenderedPageBreak/>
+        <w:drawing>
+          <wp:inline distT="0" distB="0" distL="0" distR="0" wp14:anchorId="4B055DE0" wp14:editId="1F00902A">
+            <wp:extent cx="5760731" cy="4343409"/>
+            <wp:effectExtent l="0" t="0" r="0" b="0"/>
+            <wp:docPr id="746254584" name="Picture 13"/>
+            <wp:cNvGraphicFramePr>
+              <a:graphicFrameLocks xmlns:a="http://schemas.openxmlformats.org/drawingml/2006/main" noChangeAspect="1"/>
+            </wp:cNvGraphicFramePr>
+            <a:graphic xmlns:a="http://schemas.openxmlformats.org/drawingml/2006/main">
+              <a:graphicData uri="http://schemas.openxmlformats.org/drawingml/2006/picture">
+                <pic:pic xmlns:pic="http://schemas.openxmlformats.org/drawingml/2006/picture">
+                  <pic:nvPicPr>
+                    <pic:cNvPr id="746254584" name="Picture 746254584"/>
+                    <pic:cNvPicPr/>
+                  </pic:nvPicPr>
+                  <pic:blipFill>
+                    <a:blip r:embed="rId39">
+                      <a:extLst>
+                        <a:ext uri="{28A0092B-C50C-407E-A947-70E740481C1C}">
+                          <a14:useLocalDpi xmlns:a14="http://schemas.microsoft.com/office/drawing/2010/main" val="0"/>
+                        </a:ext>
+                      </a:extLst>
+                    </a:blip>
+                    <a:stretch>
+                      <a:fillRect/>
+                    </a:stretch>
+                  </pic:blipFill>
+                  <pic:spPr>
+                    <a:xfrm>
+                      <a:off x="0" y="0"/>
+                      <a:ext cx="5760731" cy="4343409"/>
+                    </a:xfrm>
+                    <a:prstGeom prst="rect">
+                      <a:avLst/>
+                    </a:prstGeom>
+                  </pic:spPr>
+                </pic:pic>
+              </a:graphicData>
+            </a:graphic>
+          </wp:inline>
+        </w:drawing>
+      </w:r>
+    </w:p>
+    <w:p>
+      <w:pPr>
+        <w:rPr>
+          <w:color w:val="EE0000"/>
+        </w:rPr>
+      </w:pPr>
+      <w:r>
+        <w:rPr>
+          <w:color w:val="EE0000"/>
+        </w:rPr>
+        <w:t xml:space="preserve">The difference between MDI and Permutation importance is that MDI measures total </w:t>
+      </w:r>
+      <w:r>
+        <w:rPr>
+          <w:color w:val="EE0000"/>
+        </w:rPr>
+        <w:t xml:space="preserve">reduction in impurity for a feature, while the other </w:t>
+      </w:r>
+      <w:r>
+        <w:rPr>
+          <w:color w:val="EE0000"/>
+        </w:rPr>
+        <w:t xml:space="preserve">measures the </w:t>
+      </w:r>
+      <w:r>
+        <w:rPr>
+          <w:color w:val="EE0000"/>
+        </w:rPr>
+        <w:t>increase in prediction error</w:t>
+      </w:r>
+      <w:r>
+        <w:rPr>
+          <w:color w:val="EE0000"/>
+        </w:rPr>
+        <w:t xml:space="preserve"> when a feature</w:t>
+      </w:r>
+      <w:r>
+        <w:rPr>
+          <w:color w:val="EE0000"/>
+        </w:rPr>
+        <w:t xml:space="preserve">’s values are </w:t>
+      </w:r>
+      <w:r>
+        <w:rPr>
+          <w:color w:val="EE0000"/>
+        </w:rPr>
+        <w:t xml:space="preserve">randomly shuffled. </w:t>
+      </w:r>
+      <w:r>
+        <w:rPr>
+          <w:color w:val="EE0000"/>
+        </w:rPr>
+        <w:t xml:space="preserve">Impurity importance can be biased towards high-cardinality features </w:t>
+      </w:r>
+      <w:r>
+        <w:rPr>
+          <w:color w:val="EE0000"/>
+        </w:rPr>
+        <w:t>since they allow more splitting thresholds</w:t>
+      </w:r>
+      <w:r>
+        <w:rPr>
+          <w:color w:val="EE0000"/>
+        </w:rPr>
+        <w:t xml:space="preserve"> (more distinct values)</w:t>
+      </w:r>
+      <w:r>
+        <w:rPr>
+          <w:color w:val="EE0000"/>
+        </w:rPr>
+        <w:t xml:space="preserve">, which increases the chance of </w:t>
+      </w:r>
+      <w:r>
+        <w:rPr>
+          <w:color w:val="EE0000"/>
+        </w:rPr>
+        <w:t>having a large impurity reduction.</w:t>
+      </w:r>
+    </w:p>
     <w:p/>
+    <w:p>
+      <w:pPr>
+        <w:pStyle w:val="Heading1"/>
+      </w:pPr>
+      <w:r>
+        <w:t>Part 4 – Boosting</w:t>
+      </w:r>
+    </w:p>
     <w:p/>
+    <w:p>
+      <w:pPr>
+        <w:pStyle w:val="Heading1"/>
+      </w:pPr>
+      <w:r>
+        <w:t>Part 5 – Combining Classifiers</w:t>
+      </w:r>
+    </w:p>
     <w:p/>
-    <w:p/>
+    <w:p>
+      <w:pPr>
+        <w:pStyle w:val="Heading1"/>
+      </w:pPr>
+      <w:r>
+        <w:lastRenderedPageBreak/>
+        <w:t>Part 6 – Final Comparison and Report</w:t>
+      </w:r>
+    </w:p>
     <w:p/>
     <w:sectPr>
       <w:pgSz w:w="12240" w:h="15840"/>

</xml_diff>